<commit_message>
Update USIU referees with titles and Gadaffi email
Patrick Ondieki (ICT Officer, PATH), Marvin Ngosa (Systems Admin, PATH),
Gadaffi Ochieng (Procurement Officer, Ampath) — regenerate CV and email.

Co-authored-by: (mesh#); <mesh029@users.noreply.github.com>
</commit_message>
<xml_diff>
--- a/JOBS/USIU-Africa-ICT-Officer/Meshack_Ariri_CV_ICT_Officer_USIU.docx
+++ b/JOBS/USIU-Africa-ICT-Officer/Meshack_Ariri_CV_ICT_Officer_USIU.docx
@@ -1379,7 +1379,7 @@
           <w:color w:val="1E293B"/>
           <w:sz w:val="20"/>
         </w:rPr>
-        <w:t>Patrick Ondieki — PATH  |  pondieki@path.org</w:t>
+        <w:t>Patrick Ondieki — ICT Officer, PATH  |  pondieki@path.org</w:t>
       </w:r>
     </w:p>
     <w:p>
@@ -1393,7 +1393,7 @@
           <w:color w:val="1E293B"/>
           <w:sz w:val="20"/>
         </w:rPr>
-        <w:t>Marvin Ngosa — PATH  |  mngosa@path.org</w:t>
+        <w:t>Marvin Ngosa — Systems Administrator, PATH  |  mngosa@path.org</w:t>
       </w:r>
     </w:p>
     <w:p>
@@ -1407,7 +1407,7 @@
           <w:color w:val="1E293B"/>
           <w:sz w:val="20"/>
         </w:rPr>
-        <w:t>Gadaffi Ochieng — PATH  |  [email — confirm before sending]</w:t>
+        <w:t>Gadaffi Ochieng — Procurement Officer, Ampath  |  ochienggadaffi@gmail.com</w:t>
       </w:r>
     </w:p>
     <w:sectPr>

</xml_diff>